<commit_message>
Name the service in build commands, add setup script to quick reference
Adding the two ZED variants silently broke every documented build
command that did not name a service. "docker compose build" builds ALL
services, so a newcomer following the setup guide would have built the
everyday image plus both ZED variants: roughly 40 minutes and 70 GB
instead of 10-20 minutes and 13 GB.

Fixed in all three places it appeared -- README.md, DOCKER_CHANGES.md
3.3, and the .docx quick reference -- each now naming
igvc_humble_fused_drive, with a note explaining why.

Also adds scripts/setup-windows.ps1 -CheckOnly as step 2 of the quick
reference. The script was described in the prerequisites section but
missing from the copy-paste block people actually use, which is where
someone new to Docker benefits from it most.

Co-Authored-By: Claude Opus 5 (1M context) <noreply@anthropic.com>
</commit_message>
<xml_diff>
--- a/docs/IGVC_2027_Docker_Setup_Guide.docx
+++ b/docs/IGVC_2027_Docker_Setup_Guide.docx
@@ -1421,24 +1421,33 @@
         <w:t>cd IGVC_robot_2027</w:t>
         <w:br/>
         <w:br/>
-        <w:t># 2. get model weights</w:t>
+        <w:t># 2. check prerequisites (docker, wsl2, gpu, disk, submodules)</w:t>
+        <w:br/>
+        <w:t>powershell -ExecutionPolicy Bypass -File .\scripts\setup-windows.ps1 -CheckOnly</w:t>
+        <w:br/>
+        <w:br/>
+        <w:t># 3. get model weights</w:t>
         <w:br/>
         <w:t>./src/igvc_lane_detection/scripts/fetch_yolopv2_weights.sh</w:t>
         <w:br/>
         <w:br/>
-        <w:t># 3. build the image (10-20 min first time)</w:t>
+        <w:t># 4. build the image (10-20 min first time)</w:t>
         <w:br/>
-        <w:t>docker compose -f docker-compose.windows.yml build</w:t>
+        <w:t>#    name the service! a bare build makes all three images</w:t>
+        <w:br/>
+        <w:t>docker compose -f docker-compose.windows.yml build \</w:t>
+        <w:br/>
+        <w:t xml:space="preserve">  igvc_humble_fused_drive</w:t>
         <w:br/>
         <w:br/>
-        <w:t># 4. open a shell in the container</w:t>
+        <w:t># 5. open a shell in the container</w:t>
         <w:br/>
         <w:t>docker compose -f docker-compose.windows.yml run --rm \</w:t>
         <w:br/>
         <w:t xml:space="preserve">  igvc_humble_fused_drive</w:t>
         <w:br/>
         <w:br/>
-        <w:t># 5. inside the container, compile the workspace</w:t>
+        <w:t># 6. inside the container, compile the workspace</w:t>
         <w:br/>
         <w:t>source /opt/ros/humble/setup.bash</w:t>
         <w:br/>
@@ -1449,7 +1458,7 @@
         <w:t>source /root/ros2_ws/install/setup.bash</w:t>
         <w:br/>
         <w:br/>
-        <w:t># 6. verify</w:t>
+        <w:t># 7. verify</w:t>
         <w:br/>
         <w:t>ros2 pkg list | grep igvc</w:t>
       </w:r>

</xml_diff>